<commit_message>
Update Al-Attiya transfer letter: specify payment continuation by Khamis Al Jaber
</commit_message>
<xml_diff>
--- a/public/reports/letter_alattiya_changan_transfer.docx
+++ b/public/reports/letter_alattiya_changan_transfer.docx
@@ -149,7 +149,7 @@
           <w:color w:val="173247"/>
           <w:sz w:val="20"/>
         </w:rPr>
-        <w:t>نرجو التكرم بالموافقة وإصدار كتابكم المعتمد بعدم الممانعة والموجه إلى إدارة المرور والدوريات (وزارة الداخلية) لاتخاذ إجراءات نقل الملكية وتعديل فئة اللوحات وفق التالي:</w:t>
+        <w:t>نرجو التكرم بالموافقة وإصدار كتابكم المعتمد بعدم الممانعة والموجه إلى إدارة المرور والدوريات (وزارة الداخلية) لاتخاذ إجراءات نقل الملكية وتعديل فئة اللوحات المرورية وفق التالي:</w:t>
       </w:r>
     </w:p>
     <w:p>
@@ -261,7 +261,7 @@
           <w:color w:val="294B62"/>
           <w:sz w:val="20"/>
         </w:rPr>
-        <w:t>تعهد وإقرار المشتري الجديد:</w:t>
+        <w:t>آلية سداد الأقساط والرسوم:</w:t>
       </w:r>
     </w:p>
     <w:p>
@@ -277,7 +277,7 @@
           <w:color w:val="173247"/>
           <w:sz w:val="19"/>
         </w:rPr>
-        <w:t>تقر وتتعهد شركة جبريل لتوزيع الأغذية والمشروبات (ذ.م.م) بسداد كافة الرسوم الإدارية والمرورية المترتبة على نقل الملكية وتغيير اللوحات، والالتزام التام بأية أقساط أو مبالغ متبقية مستحقة لصالحكم تخص هذه المركبات وفقاً للاتفاق المبرم.</w:t>
+        <w:t>نحيطكم علماً ونؤكد بأن سداد الأقساط الشهرية والتسهيلات التمويلية المتبقية لصالحكم الخاصة بهذه المركبات سيستمر كما هو قائم ومعمول به حالياً من قبل السيد / خميس هاشم الجبر دون أي تغيير أو تأخير في مواعيد استحقاقها المعتمدة، في حين تتحمل شركة جبريل لتوزيع الأغذية والمشروبات (ذ.م.م) كافة الرسوم الإدارية والمرورية المترتبة على نقل الملكية وتغيير اللوحات إلى خصوصي.</w:t>
       </w:r>
     </w:p>
     <w:p>
@@ -340,7 +340,7 @@
                 <w:color w:val="294B62"/>
                 <w:sz w:val="19"/>
               </w:rPr>
-              <w:t>عن الطرف الأول (المتنازل):</w:t>
+              <w:t>عن الطرف الأول (المتنازل والملتزم بالسداد):</w:t>
               <w:br/>
             </w:r>
             <w:r>

</xml_diff>